<commit_message>
Added details to report
</commit_message>
<xml_diff>
--- a/ai_12/oleh_pylypiak/epic_2/epic_2_report_oleh_pylypiak.docx
+++ b/ai_12/oleh_pylypiak/epic_2/epic_2_report_oleh_pylypiak.docx
@@ -5643,9 +5643,14 @@
       <w:pPr>
         <w:spacing w:after="60"/>
       </w:pPr>
-      <w:r>
-        <w:t>-</w:t>
-      </w:r>
+      <w:hyperlink r:id="rId30" w:history="1">
+        <w:r>
+          <w:rPr>
+            <w:rStyle w:val="af2"/>
+          </w:rPr>
+          <w:t>https://github.com/artificial-intelligence-department/ai_programming_playground_2026/pull/371/changes#diff-68de826471f12dfa2c2fb77ff6f9e5c2a4db66aec458360bae7c8763667f2257</w:t>
+        </w:r>
+      </w:hyperlink>
     </w:p>
     <w:p>
       <w:pPr>
@@ -5728,7 +5733,7 @@
                     <pic:cNvPicPr/>
                   </pic:nvPicPr>
                   <pic:blipFill>
-                    <a:blip r:embed="rId30"/>
+                    <a:blip r:embed="rId31"/>
                     <a:stretch>
                       <a:fillRect/>
                     </a:stretch>
@@ -5798,9 +5803,14 @@
       <w:pPr>
         <w:spacing w:after="60"/>
       </w:pPr>
-      <w:r>
-        <w:t>-</w:t>
-      </w:r>
+      <w:hyperlink r:id="rId32" w:history="1">
+        <w:r>
+          <w:rPr>
+            <w:rStyle w:val="af2"/>
+          </w:rPr>
+          <w:t>https://github.com/artificial-intelligence-department/ai_programming_playground_2026/pull/371/changes#diff-ac3562b7be96e94750ba2a72af17bd535d6fb459315f8b454ee15f8f4a6732c0</w:t>
+        </w:r>
+      </w:hyperlink>
     </w:p>
     <w:p>
       <w:pPr>
@@ -5992,7 +6002,7 @@
                     <pic:cNvPicPr/>
                   </pic:nvPicPr>
                   <pic:blipFill>
-                    <a:blip r:embed="rId31"/>
+                    <a:blip r:embed="rId33"/>
                     <a:stretch>
                       <a:fillRect/>
                     </a:stretch>
@@ -6068,13 +6078,318 @@
     <w:p>
       <w:pPr>
         <w:spacing w:after="60"/>
-        <w:rPr>
-          <w:lang w:val="en-US"/>
-        </w:rPr>
-      </w:pPr>
-      <w:r>
-        <w:t>-</w:t>
-      </w:r>
+      </w:pPr>
+      <w:hyperlink r:id="rId34" w:history="1">
+        <w:r>
+          <w:rPr>
+            <w:rStyle w:val="af2"/>
+            <w:lang w:val="en-US"/>
+          </w:rPr>
+          <w:t>https</w:t>
+        </w:r>
+        <w:r>
+          <w:rPr>
+            <w:rStyle w:val="af2"/>
+          </w:rPr>
+          <w:t>://</w:t>
+        </w:r>
+        <w:proofErr w:type="spellStart"/>
+        <w:r>
+          <w:rPr>
+            <w:rStyle w:val="af2"/>
+            <w:lang w:val="en-US"/>
+          </w:rPr>
+          <w:t>github</w:t>
+        </w:r>
+        <w:proofErr w:type="spellEnd"/>
+        <w:r>
+          <w:rPr>
+            <w:rStyle w:val="af2"/>
+          </w:rPr>
+          <w:t>.</w:t>
+        </w:r>
+        <w:r>
+          <w:rPr>
+            <w:rStyle w:val="af2"/>
+            <w:lang w:val="en-US"/>
+          </w:rPr>
+          <w:t>com</w:t>
+        </w:r>
+        <w:r>
+          <w:rPr>
+            <w:rStyle w:val="af2"/>
+          </w:rPr>
+          <w:t>/</w:t>
+        </w:r>
+        <w:r>
+          <w:rPr>
+            <w:rStyle w:val="af2"/>
+            <w:lang w:val="en-US"/>
+          </w:rPr>
+          <w:t>artificial</w:t>
+        </w:r>
+        <w:r>
+          <w:rPr>
+            <w:rStyle w:val="af2"/>
+          </w:rPr>
+          <w:t>-</w:t>
+        </w:r>
+        <w:r>
+          <w:rPr>
+            <w:rStyle w:val="af2"/>
+            <w:lang w:val="en-US"/>
+          </w:rPr>
+          <w:t>intelligence</w:t>
+        </w:r>
+        <w:r>
+          <w:rPr>
+            <w:rStyle w:val="af2"/>
+          </w:rPr>
+          <w:t>-</w:t>
+        </w:r>
+        <w:r>
+          <w:rPr>
+            <w:rStyle w:val="af2"/>
+            <w:lang w:val="en-US"/>
+          </w:rPr>
+          <w:t>department</w:t>
+        </w:r>
+        <w:r>
+          <w:rPr>
+            <w:rStyle w:val="af2"/>
+          </w:rPr>
+          <w:t>/</w:t>
+        </w:r>
+        <w:r>
+          <w:rPr>
+            <w:rStyle w:val="af2"/>
+            <w:lang w:val="en-US"/>
+          </w:rPr>
+          <w:t>ai</w:t>
+        </w:r>
+        <w:r>
+          <w:rPr>
+            <w:rStyle w:val="af2"/>
+          </w:rPr>
+          <w:t>_</w:t>
+        </w:r>
+        <w:r>
+          <w:rPr>
+            <w:rStyle w:val="af2"/>
+            <w:lang w:val="en-US"/>
+          </w:rPr>
+          <w:t>programming</w:t>
+        </w:r>
+        <w:r>
+          <w:rPr>
+            <w:rStyle w:val="af2"/>
+          </w:rPr>
+          <w:t>_</w:t>
+        </w:r>
+        <w:r>
+          <w:rPr>
+            <w:rStyle w:val="af2"/>
+            <w:lang w:val="en-US"/>
+          </w:rPr>
+          <w:t>playground</w:t>
+        </w:r>
+        <w:r>
+          <w:rPr>
+            <w:rStyle w:val="af2"/>
+          </w:rPr>
+          <w:t>_2026/</w:t>
+        </w:r>
+        <w:r>
+          <w:rPr>
+            <w:rStyle w:val="af2"/>
+            <w:lang w:val="en-US"/>
+          </w:rPr>
+          <w:t>pull</w:t>
+        </w:r>
+        <w:r>
+          <w:rPr>
+            <w:rStyle w:val="af2"/>
+          </w:rPr>
+          <w:t>/371/</w:t>
+        </w:r>
+        <w:r>
+          <w:rPr>
+            <w:rStyle w:val="af2"/>
+            <w:lang w:val="en-US"/>
+          </w:rPr>
+          <w:t>changes</w:t>
+        </w:r>
+        <w:r>
+          <w:rPr>
+            <w:rStyle w:val="af2"/>
+          </w:rPr>
+          <w:t>#</w:t>
+        </w:r>
+        <w:r>
+          <w:rPr>
+            <w:rStyle w:val="af2"/>
+            <w:lang w:val="en-US"/>
+          </w:rPr>
+          <w:t>diff</w:t>
+        </w:r>
+        <w:r>
+          <w:rPr>
+            <w:rStyle w:val="af2"/>
+          </w:rPr>
+          <w:t>-1</w:t>
+        </w:r>
+        <w:r>
+          <w:rPr>
+            <w:rStyle w:val="af2"/>
+            <w:lang w:val="en-US"/>
+          </w:rPr>
+          <w:t>d</w:t>
+        </w:r>
+        <w:r>
+          <w:rPr>
+            <w:rStyle w:val="af2"/>
+          </w:rPr>
+          <w:t>49901312</w:t>
+        </w:r>
+        <w:proofErr w:type="spellStart"/>
+        <w:r>
+          <w:rPr>
+            <w:rStyle w:val="af2"/>
+            <w:lang w:val="en-US"/>
+          </w:rPr>
+          <w:t>cdc</w:t>
+        </w:r>
+        <w:proofErr w:type="spellEnd"/>
+        <w:r>
+          <w:rPr>
+            <w:rStyle w:val="af2"/>
+          </w:rPr>
+          <w:t>2</w:t>
+        </w:r>
+        <w:r>
+          <w:rPr>
+            <w:rStyle w:val="af2"/>
+            <w:lang w:val="en-US"/>
+          </w:rPr>
+          <w:t>e</w:t>
+        </w:r>
+        <w:r>
+          <w:rPr>
+            <w:rStyle w:val="af2"/>
+          </w:rPr>
+          <w:t>92</w:t>
+        </w:r>
+        <w:proofErr w:type="spellStart"/>
+        <w:r>
+          <w:rPr>
+            <w:rStyle w:val="af2"/>
+            <w:lang w:val="en-US"/>
+          </w:rPr>
+          <w:t>ec</w:t>
+        </w:r>
+        <w:proofErr w:type="spellEnd"/>
+        <w:r>
+          <w:rPr>
+            <w:rStyle w:val="af2"/>
+          </w:rPr>
+          <w:t>7</w:t>
+        </w:r>
+        <w:proofErr w:type="spellStart"/>
+        <w:r>
+          <w:rPr>
+            <w:rStyle w:val="af2"/>
+            <w:lang w:val="en-US"/>
+          </w:rPr>
+          <w:t>fd</w:t>
+        </w:r>
+        <w:proofErr w:type="spellEnd"/>
+        <w:r>
+          <w:rPr>
+            <w:rStyle w:val="af2"/>
+          </w:rPr>
+          <w:t>5</w:t>
+        </w:r>
+        <w:r>
+          <w:rPr>
+            <w:rStyle w:val="af2"/>
+            <w:lang w:val="en-US"/>
+          </w:rPr>
+          <w:t>c</w:t>
+        </w:r>
+        <w:r>
+          <w:rPr>
+            <w:rStyle w:val="af2"/>
+          </w:rPr>
+          <w:t>723</w:t>
+        </w:r>
+        <w:proofErr w:type="spellStart"/>
+        <w:r>
+          <w:rPr>
+            <w:rStyle w:val="af2"/>
+            <w:lang w:val="en-US"/>
+          </w:rPr>
+          <w:t>eb</w:t>
+        </w:r>
+        <w:proofErr w:type="spellEnd"/>
+        <w:r>
+          <w:rPr>
+            <w:rStyle w:val="af2"/>
+          </w:rPr>
+          <w:t>14895</w:t>
+        </w:r>
+        <w:r>
+          <w:rPr>
+            <w:rStyle w:val="af2"/>
+            <w:lang w:val="en-US"/>
+          </w:rPr>
+          <w:t>bb</w:t>
+        </w:r>
+        <w:r>
+          <w:rPr>
+            <w:rStyle w:val="af2"/>
+          </w:rPr>
+          <w:t>16059</w:t>
+        </w:r>
+        <w:r>
+          <w:rPr>
+            <w:rStyle w:val="af2"/>
+            <w:lang w:val="en-US"/>
+          </w:rPr>
+          <w:t>f</w:t>
+        </w:r>
+        <w:r>
+          <w:rPr>
+            <w:rStyle w:val="af2"/>
+          </w:rPr>
+          <w:t>2638139215</w:t>
+        </w:r>
+        <w:r>
+          <w:rPr>
+            <w:rStyle w:val="af2"/>
+            <w:lang w:val="en-US"/>
+          </w:rPr>
+          <w:t>d</w:t>
+        </w:r>
+        <w:r>
+          <w:rPr>
+            <w:rStyle w:val="af2"/>
+          </w:rPr>
+          <w:t>409462</w:t>
+        </w:r>
+        <w:r>
+          <w:rPr>
+            <w:rStyle w:val="af2"/>
+            <w:lang w:val="en-US"/>
+          </w:rPr>
+          <w:t>ad</w:t>
+        </w:r>
+        <w:r>
+          <w:rPr>
+            <w:rStyle w:val="af2"/>
+          </w:rPr>
+          <w:t>209</w:t>
+        </w:r>
+      </w:hyperlink>
     </w:p>
     <w:p>
       <w:pPr>
@@ -6254,7 +6569,7 @@
                     <pic:cNvPicPr/>
                   </pic:nvPicPr>
                   <pic:blipFill>
-                    <a:blip r:embed="rId32">
+                    <a:blip r:embed="rId35">
                       <a:extLst>
                         <a:ext uri="{28A0092B-C50C-407E-A947-70E740481C1C}">
                           <a14:useLocalDpi xmlns:a14="http://schemas.microsoft.com/office/drawing/2010/main" val="0"/>
@@ -6336,7 +6651,7 @@
                     <pic:cNvPicPr/>
                   </pic:nvPicPr>
                   <pic:blipFill>
-                    <a:blip r:embed="rId33"/>
+                    <a:blip r:embed="rId36"/>
                     <a:stretch>
                       <a:fillRect/>
                     </a:stretch>
@@ -6394,16 +6709,30 @@
         <w:rPr>
           <w:rFonts w:eastAsia="Times New Roman"/>
           <w:szCs w:val="24"/>
-          <w:lang w:val="ru-RU"/>
-        </w:rPr>
-      </w:pPr>
-      <w:r>
-        <w:rPr>
-          <w:rFonts w:eastAsia="Times New Roman"/>
-          <w:szCs w:val="24"/>
-          <w:lang w:val="ru-RU"/>
-        </w:rPr>
-        <w:t>-</w:t>
+        </w:rPr>
+      </w:pPr>
+      <w:r>
+        <w:rPr>
+          <w:rFonts w:eastAsia="Times New Roman"/>
+          <w:szCs w:val="24"/>
+        </w:rPr>
+        <w:t xml:space="preserve">Посилання на файл коду в </w:t>
+      </w:r>
+      <w:proofErr w:type="spellStart"/>
+      <w:r>
+        <w:rPr>
+          <w:rFonts w:eastAsia="Times New Roman"/>
+          <w:szCs w:val="24"/>
+        </w:rPr>
+        <w:t>пулреквесті</w:t>
+      </w:r>
+      <w:proofErr w:type="spellEnd"/>
+      <w:r>
+        <w:rPr>
+          <w:rFonts w:eastAsia="Times New Roman"/>
+          <w:szCs w:val="24"/>
+        </w:rPr>
+        <w:t>:</w:t>
       </w:r>
     </w:p>
     <w:p>
@@ -6414,29 +6743,16 @@
           <w:szCs w:val="24"/>
         </w:rPr>
       </w:pPr>
-      <w:r>
-        <w:rPr>
-          <w:rFonts w:eastAsia="Times New Roman"/>
-          <w:szCs w:val="24"/>
-        </w:rPr>
-        <w:t xml:space="preserve">Посилання на файл коду в </w:t>
-      </w:r>
-      <w:proofErr w:type="spellStart"/>
-      <w:r>
-        <w:rPr>
-          <w:rFonts w:eastAsia="Times New Roman"/>
-          <w:szCs w:val="24"/>
-        </w:rPr>
-        <w:t>пулреквесті</w:t>
-      </w:r>
-      <w:proofErr w:type="spellEnd"/>
-      <w:r>
-        <w:rPr>
-          <w:rFonts w:eastAsia="Times New Roman"/>
-          <w:szCs w:val="24"/>
-        </w:rPr>
-        <w:t>:</w:t>
-      </w:r>
+      <w:hyperlink r:id="rId37" w:history="1">
+        <w:r>
+          <w:rPr>
+            <w:rStyle w:val="af2"/>
+            <w:rFonts w:eastAsia="Times New Roman"/>
+            <w:szCs w:val="24"/>
+          </w:rPr>
+          <w:t>https://github.com/artificial-intelligence-department/ai_programming_playground_2026/pull/371/changes#diff-b772529d21c5d1e316f891c847dded526592f80aa192a01117b0ce7ea4dfd4a6</w:t>
+        </w:r>
+      </w:hyperlink>
     </w:p>
     <w:p>
       <w:pPr>
@@ -6621,7 +6937,7 @@
                     <pic:cNvPicPr/>
                   </pic:nvPicPr>
                   <pic:blipFill>
-                    <a:blip r:embed="rId34"/>
+                    <a:blip r:embed="rId38"/>
                     <a:stretch>
                       <a:fillRect/>
                     </a:stretch>
@@ -6676,15 +6992,6 @@
     </w:p>
     <w:p>
       <w:pPr>
-        <w:pStyle w:val="af5"/>
-        <w:rPr>
-          <w:rFonts w:eastAsia="Times New Roman"/>
-          <w:szCs w:val="24"/>
-        </w:rPr>
-      </w:pPr>
-    </w:p>
-    <w:p>
-      <w:pPr>
         <w:spacing w:after="60"/>
         <w:rPr>
           <w:rFonts w:eastAsia="Times New Roman"/>
@@ -6696,7 +7003,23 @@
           <w:rFonts w:eastAsia="Times New Roman"/>
           <w:szCs w:val="24"/>
         </w:rPr>
-        <w:t>-</w:t>
+        <w:t xml:space="preserve">Посилання на файл коду в </w:t>
+      </w:r>
+      <w:proofErr w:type="spellStart"/>
+      <w:r>
+        <w:rPr>
+          <w:rFonts w:eastAsia="Times New Roman"/>
+          <w:szCs w:val="24"/>
+        </w:rPr>
+        <w:t>пулреквесті</w:t>
+      </w:r>
+      <w:proofErr w:type="spellEnd"/>
+      <w:r>
+        <w:rPr>
+          <w:rFonts w:eastAsia="Times New Roman"/>
+          <w:szCs w:val="24"/>
+        </w:rPr>
+        <w:t>:</w:t>
       </w:r>
     </w:p>
     <w:p>
@@ -6707,38 +7030,16 @@
           <w:szCs w:val="24"/>
         </w:rPr>
       </w:pPr>
-      <w:r>
-        <w:rPr>
-          <w:rFonts w:eastAsia="Times New Roman"/>
-          <w:szCs w:val="24"/>
-        </w:rPr>
-        <w:t xml:space="preserve">Посилання на файл коду в </w:t>
-      </w:r>
-      <w:proofErr w:type="spellStart"/>
-      <w:r>
-        <w:rPr>
-          <w:rFonts w:eastAsia="Times New Roman"/>
-          <w:szCs w:val="24"/>
-        </w:rPr>
-        <w:t>пулреквесті</w:t>
-      </w:r>
-      <w:proofErr w:type="spellEnd"/>
-      <w:r>
-        <w:rPr>
-          <w:rFonts w:eastAsia="Times New Roman"/>
-          <w:szCs w:val="24"/>
-        </w:rPr>
-        <w:t>:</w:t>
-      </w:r>
-    </w:p>
-    <w:p>
-      <w:pPr>
-        <w:spacing w:after="60"/>
-        <w:rPr>
-          <w:rFonts w:eastAsia="Times New Roman"/>
-          <w:szCs w:val="24"/>
-        </w:rPr>
-      </w:pPr>
+      <w:hyperlink r:id="rId39" w:history="1">
+        <w:r>
+          <w:rPr>
+            <w:rStyle w:val="af2"/>
+            <w:rFonts w:eastAsia="Times New Roman"/>
+            <w:szCs w:val="24"/>
+          </w:rPr>
+          <w:t>https://github.com/artificial-intelligence-department/ai_programming_playground_2026/pull/371/changes#diff-ba1ca0655498dbabe31d3a773c9e1a82d6b219869f885c9a2fd470dd2849c31f</w:t>
+        </w:r>
+      </w:hyperlink>
     </w:p>
     <w:p>
       <w:pPr>
@@ -6898,7 +7199,7 @@
                     <pic:cNvPicPr/>
                   </pic:nvPicPr>
                   <pic:blipFill>
-                    <a:blip r:embed="rId35"/>
+                    <a:blip r:embed="rId40"/>
                     <a:stretch>
                       <a:fillRect/>
                     </a:stretch>
@@ -6960,13 +7261,6 @@
           <w:szCs w:val="24"/>
         </w:rPr>
       </w:pPr>
-      <w:r>
-        <w:rPr>
-          <w:rFonts w:eastAsia="Times New Roman"/>
-          <w:szCs w:val="24"/>
-        </w:rPr>
-        <w:t>-</w:t>
-      </w:r>
     </w:p>
     <w:p>
       <w:pPr>
@@ -6999,6 +7293,29 @@
         </w:rPr>
         <w:t>:</w:t>
       </w:r>
+    </w:p>
+    <w:p>
+      <w:pPr>
+        <w:spacing w:after="60"/>
+        <w:rPr>
+          <w:rFonts w:eastAsia="Times New Roman"/>
+          <w:b/>
+          <w:bCs/>
+          <w:szCs w:val="24"/>
+        </w:rPr>
+      </w:pPr>
+      <w:hyperlink r:id="rId41" w:history="1">
+        <w:r>
+          <w:rPr>
+            <w:rStyle w:val="af2"/>
+            <w:rFonts w:eastAsia="Times New Roman"/>
+            <w:b/>
+            <w:bCs/>
+            <w:szCs w:val="24"/>
+          </w:rPr>
+          <w:t>https://github.com/artificial-intelligence-department/ai_programming_playground_2026/pull/371/changes#diff-4613a81c606abc90302f60fe7cb0986e6c1bdeb8d9f46fd8badfd1b06b3a34d9</w:t>
+        </w:r>
+      </w:hyperlink>
     </w:p>
     <w:p>
       <w:pPr>
@@ -7176,6 +7493,7 @@
           <w:noProof/>
           <w:szCs w:val="24"/>
         </w:rPr>
+        <w:lastRenderedPageBreak/>
         <w:drawing>
           <wp:inline distT="0" distB="0" distL="0" distR="0" wp14:anchorId="4F4B5836" wp14:editId="1883F021">
             <wp:extent cx="2676899" cy="743054"/>
@@ -7192,7 +7510,7 @@
                     <pic:cNvPicPr/>
                   </pic:nvPicPr>
                   <pic:blipFill>
-                    <a:blip r:embed="rId36"/>
+                    <a:blip r:embed="rId42"/>
                     <a:stretch>
                       <a:fillRect/>
                     </a:stretch>
@@ -7240,7 +7558,6 @@
     </w:p>
     <w:p>
       <w:r>
-        <w:lastRenderedPageBreak/>
         <w:t>Пояснення чому так:</w:t>
       </w:r>
     </w:p>
@@ -7434,7 +7751,7 @@
                     <pic:cNvPicPr/>
                   </pic:nvPicPr>
                   <pic:blipFill>
-                    <a:blip r:embed="rId37">
+                    <a:blip r:embed="rId43">
                       <a:extLst>
                         <a:ext uri="{28A0092B-C50C-407E-A947-70E740481C1C}">
                           <a14:useLocalDpi xmlns:a14="http://schemas.microsoft.com/office/drawing/2010/main" val="0"/>
@@ -7513,6 +7830,7 @@
         </w:numPr>
       </w:pPr>
       <w:r>
+        <w:lastRenderedPageBreak/>
         <w:t>Вираз ++n * ++m (</w:t>
       </w:r>
       <w:proofErr w:type="spellStart"/>
@@ -7631,7 +7949,6 @@
         </w:numPr>
       </w:pPr>
       <w:r>
-        <w:lastRenderedPageBreak/>
         <w:t xml:space="preserve">Вираз n++ &gt; m (Постфіксний </w:t>
       </w:r>
       <w:proofErr w:type="spellStart"/>
@@ -7777,7 +8094,7 @@
                     <pic:cNvPicPr/>
                   </pic:nvPicPr>
                   <pic:blipFill>
-                    <a:blip r:embed="rId38">
+                    <a:blip r:embed="rId44">
                       <a:extLst>
                         <a:ext uri="{28A0092B-C50C-407E-A947-70E740481C1C}">
                           <a14:useLocalDpi xmlns:a14="http://schemas.microsoft.com/office/drawing/2010/main" val="0"/>
@@ -7834,6 +8151,7 @@
         <w:rPr>
           <w:lang w:val="en-US"/>
         </w:rPr>
+        <w:lastRenderedPageBreak/>
         <w:t>-</w:t>
       </w:r>
     </w:p>
@@ -7909,7 +8227,6 @@
         <w:rPr>
           <w:noProof/>
         </w:rPr>
-        <w:lastRenderedPageBreak/>
         <w:drawing>
           <wp:inline distT="0" distB="0" distL="0" distR="0" wp14:anchorId="75488963" wp14:editId="7ACB8FA0">
             <wp:extent cx="5468113" cy="1533739"/>
@@ -7926,7 +8243,7 @@
                     <pic:cNvPicPr/>
                   </pic:nvPicPr>
                   <pic:blipFill>
-                    <a:blip r:embed="rId39"/>
+                    <a:blip r:embed="rId45"/>
                     <a:stretch>
                       <a:fillRect/>
                     </a:stretch>
@@ -7999,7 +8316,7 @@
                     <pic:cNvPicPr/>
                   </pic:nvPicPr>
                   <pic:blipFill>
-                    <a:blip r:embed="rId40"/>
+                    <a:blip r:embed="rId46"/>
                     <a:stretch>
                       <a:fillRect/>
                     </a:stretch>
@@ -8083,7 +8400,7 @@
                     <pic:cNvPicPr/>
                   </pic:nvPicPr>
                   <pic:blipFill>
-                    <a:blip r:embed="rId41">
+                    <a:blip r:embed="rId47">
                       <a:extLst>
                         <a:ext uri="{28A0092B-C50C-407E-A947-70E740481C1C}">
                           <a14:useLocalDpi xmlns:a14="http://schemas.microsoft.com/office/drawing/2010/main" val="0"/>
@@ -8157,6 +8474,7 @@
           <w:noProof/>
           <w:lang w:val="en-US"/>
         </w:rPr>
+        <w:lastRenderedPageBreak/>
         <w:drawing>
           <wp:inline distT="0" distB="0" distL="0" distR="0" wp14:anchorId="08DC29AC" wp14:editId="013756B9">
             <wp:extent cx="5830114" cy="1524213"/>
@@ -8173,7 +8491,7 @@
                     <pic:cNvPicPr/>
                   </pic:nvPicPr>
                   <pic:blipFill>
-                    <a:blip r:embed="rId42"/>
+                    <a:blip r:embed="rId48"/>
                     <a:stretch>
                       <a:fillRect/>
                     </a:stretch>
@@ -8241,7 +8559,6 @@
           <w:noProof/>
           <w:lang w:val="en-US"/>
         </w:rPr>
-        <w:lastRenderedPageBreak/>
         <w:drawing>
           <wp:inline distT="0" distB="0" distL="0" distR="0" wp14:anchorId="3068FDF3" wp14:editId="46E33103">
             <wp:extent cx="5839640" cy="1648055"/>
@@ -8258,7 +8575,7 @@
                     <pic:cNvPicPr/>
                   </pic:nvPicPr>
                   <pic:blipFill>
-                    <a:blip r:embed="rId43"/>
+                    <a:blip r:embed="rId49"/>
                     <a:stretch>
                       <a:fillRect/>
                     </a:stretch>
@@ -8342,7 +8659,7 @@
                     <pic:cNvPicPr/>
                   </pic:nvPicPr>
                   <pic:blipFill>
-                    <a:blip r:embed="rId44"/>
+                    <a:blip r:embed="rId50"/>
                     <a:stretch>
                       <a:fillRect/>
                     </a:stretch>
@@ -8426,7 +8743,7 @@
                     <pic:cNvPicPr/>
                   </pic:nvPicPr>
                   <pic:blipFill>
-                    <a:blip r:embed="rId45"/>
+                    <a:blip r:embed="rId51"/>
                     <a:stretch>
                       <a:fillRect/>
                     </a:stretch>
@@ -8494,6 +8811,7 @@
           <w:noProof/>
           <w:lang w:val="en-US"/>
         </w:rPr>
+        <w:lastRenderedPageBreak/>
         <w:drawing>
           <wp:inline distT="0" distB="0" distL="0" distR="0" wp14:anchorId="3199ED79" wp14:editId="7938050F">
             <wp:extent cx="5868219" cy="1486107"/>
@@ -8510,7 +8828,7 @@
                     <pic:cNvPicPr/>
                   </pic:nvPicPr>
                   <pic:blipFill>
-                    <a:blip r:embed="rId46"/>
+                    <a:blip r:embed="rId52"/>
                     <a:stretch>
                       <a:fillRect/>
                     </a:stretch>
@@ -8578,7 +8896,6 @@
           <w:noProof/>
           <w:lang w:val="en-US"/>
         </w:rPr>
-        <w:lastRenderedPageBreak/>
         <w:drawing>
           <wp:inline distT="0" distB="0" distL="0" distR="0" wp14:anchorId="7CBFEDD6" wp14:editId="6A141FA1">
             <wp:extent cx="5820587" cy="1457528"/>
@@ -8595,7 +8912,7 @@
                     <pic:cNvPicPr/>
                   </pic:nvPicPr>
                   <pic:blipFill>
-                    <a:blip r:embed="rId47"/>
+                    <a:blip r:embed="rId53"/>
                     <a:stretch>
                       <a:fillRect/>
                     </a:stretch>
@@ -8679,7 +8996,7 @@
                     <pic:cNvPicPr/>
                   </pic:nvPicPr>
                   <pic:blipFill>
-                    <a:blip r:embed="rId48"/>
+                    <a:blip r:embed="rId54"/>
                     <a:stretch>
                       <a:fillRect/>
                     </a:stretch>
@@ -8763,7 +9080,7 @@
                     <pic:cNvPicPr/>
                   </pic:nvPicPr>
                   <pic:blipFill>
-                    <a:blip r:embed="rId49"/>
+                    <a:blip r:embed="rId55"/>
                     <a:stretch>
                       <a:fillRect/>
                     </a:stretch>
@@ -8831,6 +9148,7 @@
           <w:noProof/>
           <w:lang w:val="en-US"/>
         </w:rPr>
+        <w:lastRenderedPageBreak/>
         <w:drawing>
           <wp:inline distT="0" distB="0" distL="0" distR="0" wp14:anchorId="5BB08450" wp14:editId="1DD0CC07">
             <wp:extent cx="5191850" cy="1305107"/>
@@ -8847,7 +9165,7 @@
                     <pic:cNvPicPr/>
                   </pic:nvPicPr>
                   <pic:blipFill>
-                    <a:blip r:embed="rId50"/>
+                    <a:blip r:embed="rId56"/>
                     <a:stretch>
                       <a:fillRect/>
                     </a:stretch>
@@ -8915,7 +9233,6 @@
           <w:noProof/>
           <w:lang w:val="en-US"/>
         </w:rPr>
-        <w:lastRenderedPageBreak/>
         <w:drawing>
           <wp:inline distT="0" distB="0" distL="0" distR="0" wp14:anchorId="06D73F92" wp14:editId="0AAE79D7">
             <wp:extent cx="5201376" cy="1295581"/>
@@ -8932,7 +9249,7 @@
                     <pic:cNvPicPr/>
                   </pic:nvPicPr>
                   <pic:blipFill>
-                    <a:blip r:embed="rId51"/>
+                    <a:blip r:embed="rId57"/>
                     <a:stretch>
                       <a:fillRect/>
                     </a:stretch>
@@ -9016,7 +9333,7 @@
                     <pic:cNvPicPr/>
                   </pic:nvPicPr>
                   <pic:blipFill>
-                    <a:blip r:embed="rId52"/>
+                    <a:blip r:embed="rId58"/>
                     <a:stretch>
                       <a:fillRect/>
                     </a:stretch>
@@ -9100,7 +9417,7 @@
                     <pic:cNvPicPr/>
                   </pic:nvPicPr>
                   <pic:blipFill>
-                    <a:blip r:embed="rId53"/>
+                    <a:blip r:embed="rId59"/>
                     <a:stretch>
                       <a:fillRect/>
                     </a:stretch>
@@ -9184,7 +9501,7 @@
                     <pic:cNvPicPr/>
                   </pic:nvPicPr>
                   <pic:blipFill>
-                    <a:blip r:embed="rId54"/>
+                    <a:blip r:embed="rId60"/>
                     <a:stretch>
                       <a:fillRect/>
                     </a:stretch>
@@ -9301,6 +9618,7 @@
           <w:noProof/>
           <w:szCs w:val="24"/>
         </w:rPr>
+        <w:lastRenderedPageBreak/>
         <w:drawing>
           <wp:inline distT="0" distB="0" distL="0" distR="0" wp14:anchorId="5DEB6EE6" wp14:editId="526E03CB">
             <wp:extent cx="6120765" cy="1996440"/>
@@ -9317,7 +9635,7 @@
                     <pic:cNvPicPr/>
                   </pic:nvPicPr>
                   <pic:blipFill>
-                    <a:blip r:embed="rId55"/>
+                    <a:blip r:embed="rId61"/>
                     <a:stretch>
                       <a:fillRect/>
                     </a:stretch>
@@ -9450,7 +9768,6 @@
           <w:noProof/>
           <w:szCs w:val="24"/>
         </w:rPr>
-        <w:lastRenderedPageBreak/>
         <w:drawing>
           <wp:inline distT="0" distB="0" distL="0" distR="0" wp14:anchorId="02F94BFF" wp14:editId="3E9436BA">
             <wp:extent cx="6120765" cy="1562735"/>
@@ -9467,7 +9784,7 @@
                     <pic:cNvPicPr/>
                   </pic:nvPicPr>
                   <pic:blipFill>
-                    <a:blip r:embed="rId56"/>
+                    <a:blip r:embed="rId62"/>
                     <a:stretch>
                       <a:fillRect/>
                     </a:stretch>
@@ -9614,7 +9931,7 @@
                     <pic:cNvPicPr/>
                   </pic:nvPicPr>
                   <pic:blipFill>
-                    <a:blip r:embed="rId57">
+                    <a:blip r:embed="rId63">
                       <a:extLst>
                         <a:ext uri="{28A0092B-C50C-407E-A947-70E740481C1C}">
                           <a14:useLocalDpi xmlns:a14="http://schemas.microsoft.com/office/drawing/2010/main" val="0"/>
@@ -9687,7 +10004,7 @@
                     <pic:cNvPicPr/>
                   </pic:nvPicPr>
                   <pic:blipFill>
-                    <a:blip r:embed="rId58">
+                    <a:blip r:embed="rId64">
                       <a:extLst>
                         <a:ext uri="{28A0092B-C50C-407E-A947-70E740481C1C}">
                           <a14:useLocalDpi xmlns:a14="http://schemas.microsoft.com/office/drawing/2010/main" val="0"/>
@@ -9745,7 +10062,7 @@
         </w:rPr>
         <w:lastRenderedPageBreak/>
         <w:drawing>
-          <wp:inline distT="0" distB="0" distL="0" distR="0" wp14:anchorId="35F7BA22" wp14:editId="769A14CC">
+          <wp:inline distT="0" distB="0" distL="0" distR="0" wp14:anchorId="35F7BA22" wp14:editId="024CFFA5">
             <wp:extent cx="4883573" cy="2747010"/>
             <wp:effectExtent l="0" t="0" r="0" b="0"/>
             <wp:docPr id="1404358804" name="Рисунок 4"/>
@@ -9760,7 +10077,7 @@
                     <pic:cNvPicPr/>
                   </pic:nvPicPr>
                   <pic:blipFill>
-                    <a:blip r:embed="rId59" cstate="print">
+                    <a:blip r:embed="rId65" cstate="print">
                       <a:extLst>
                         <a:ext uri="{28A0092B-C50C-407E-A947-70E740481C1C}">
                           <a14:useLocalDpi xmlns:a14="http://schemas.microsoft.com/office/drawing/2010/main" val="0"/>
@@ -9832,7 +10149,7 @@
                     <pic:cNvPicPr/>
                   </pic:nvPicPr>
                   <pic:blipFill>
-                    <a:blip r:embed="rId60">
+                    <a:blip r:embed="rId66">
                       <a:extLst>
                         <a:ext uri="{28A0092B-C50C-407E-A947-70E740481C1C}">
                           <a14:useLocalDpi xmlns:a14="http://schemas.microsoft.com/office/drawing/2010/main" val="0"/>
@@ -10057,8 +10374,8 @@
     </w:p>
     <w:p/>
     <w:sectPr>
-      <w:footerReference w:type="default" r:id="rId61"/>
-      <w:footerReference w:type="first" r:id="rId62"/>
+      <w:footerReference w:type="default" r:id="rId67"/>
+      <w:footerReference w:type="first" r:id="rId68"/>
       <w:pgSz w:w="11906" w:h="16838"/>
       <w:pgMar w:top="850" w:right="850" w:bottom="850" w:left="1417" w:header="708" w:footer="708" w:gutter="0"/>
       <w:cols w:space="708"/>
@@ -10104,6 +10421,7 @@
         <w:docPartUnique/>
       </w:docPartObj>
     </w:sdtPr>
+    <w:sdtEndPr/>
     <w:sdtContent>
       <w:p>
         <w:pPr>

</xml_diff>